<commit_message>
removed internal only AI policy link
</commit_message>
<xml_diff>
--- a/resources/C964_Task1_Approval_Form.docx
+++ b/resources/C964_Task1_Approval_Form.docx
@@ -4,6 +4,7 @@
   <w:body>
     <w:p>
       <w:pPr>
+        <w:pStyle w:val="Title"/>
         <w:spacing w:after="60"/>
         <w:rPr>
           <w:b w:val="1"/>
@@ -15,17 +16,15 @@
       </w:pPr>
       <w:r>
         <w:rPr>
-          <w:b w:val="1"/>
-          <w:bCs w:val="1"/>
-          <w:color w:val="002060"/>
-          <w:sz w:val="44"/>
-          <w:szCs w:val="44"/>
+          <w:rFonts w:ascii="Arial" w:hAnsi="Arial" w:cs="Arial"/>
+          <w:color w:val="002855"/>
         </w:rPr>
         <w:t>C964 Computer Science Capstone</w:t>
       </w:r>
     </w:p>
     <w:p>
       <w:pPr>
+        <w:pStyle w:val="Heading1"/>
         <w:spacing w:after="160"/>
         <w:rPr>
           <w:b w:val="1"/>
@@ -37,144 +36,144 @@
       </w:pPr>
       <w:r>
         <w:rPr>
+          <w:rFonts w:ascii="Arial" w:hAnsi="Arial" w:cs="Arial"/>
+          <w:color w:val="002855"/>
+        </w:rPr>
+        <w:t>Task 1 — Topic Approval Form</w:t>
+      </w:r>
+    </w:p>
+    <w:p>
+      <w:pPr>
+        <w:spacing w:after="60"/>
+        <w:rPr>
+          <w:sz w:val="28"/>
+          <w:szCs w:val="28"/>
+        </w:rPr>
+      </w:pPr>
+      <w:r>
+        <w:rPr>
+          <w:rFonts w:ascii="Arial" w:hAnsi="Arial" w:cs="Arial"/>
+          <w:b w:val="1"/>
+          <w:bCs w:val="1"/>
+          <w:sz w:val="28"/>
+          <w:szCs w:val="28"/>
+        </w:rPr>
+        <w:t xml:space="preserve">Purpose. </w:t>
+      </w:r>
+      <w:r>
+        <w:rPr>
+          <w:rFonts w:ascii="Arial" w:hAnsi="Arial" w:cs="Arial"/>
+          <w:sz w:val="28"/>
+          <w:szCs w:val="28"/>
+        </w:rPr>
+        <w:t>To confirm a viable topic before Task 2. Approval requires three things: a planned data source, a model derived from that data, and a way for a user to provide input and receive output from the model.</w:t>
+      </w:r>
+    </w:p>
+    <w:p>
+      <w:pPr>
+        <w:spacing w:after="60"/>
+        <w:rPr>
+          <w:sz w:val="28"/>
+          <w:szCs w:val="28"/>
+        </w:rPr>
+      </w:pPr>
+      <w:r>
+        <w:rPr>
+          <w:rFonts w:ascii="Arial" w:hAnsi="Arial" w:cs="Arial"/>
+          <w:b w:val="1"/>
+          <w:bCs w:val="1"/>
+          <w:sz w:val="28"/>
+          <w:szCs w:val="28"/>
+        </w:rPr>
+        <w:t xml:space="preserve">The model is the project. </w:t>
+      </w:r>
+      <w:r>
+        <w:rPr>
+          <w:rFonts w:ascii="Arial" w:hAnsi="Arial" w:cs="Arial"/>
+          <w:sz w:val="28"/>
+          <w:szCs w:val="28"/>
+        </w:rPr>
+        <w:t>The project must include a model — something whose behavior is shaped by data, such that the application would not work the same way without it. For example, a classifier, a clustering algorithm, a pretrained model, or an ML method.</w:t>
+      </w:r>
+    </w:p>
+    <w:p>
+      <w:pPr>
+        <w:spacing w:after="100"/>
+        <w:rPr>
+          <w:sz w:val="28"/>
+          <w:szCs w:val="28"/>
+        </w:rPr>
+      </w:pPr>
+      <w:r>
+        <w:rPr>
+          <w:rFonts w:ascii="Arial" w:hAnsi="Arial" w:cs="Arial"/>
+          <w:b w:val="1"/>
+          <w:bCs w:val="1"/>
+          <w:sz w:val="28"/>
+          <w:szCs w:val="28"/>
+        </w:rPr>
+        <w:t xml:space="preserve">Use determines the user. </w:t>
+      </w:r>
+      <w:r>
+        <w:rPr>
+          <w:rFonts w:ascii="Arial" w:hAnsi="Arial" w:cs="Arial"/>
+          <w:sz w:val="28"/>
+          <w:szCs w:val="28"/>
+        </w:rPr>
+        <w:t xml:space="preserve">Other requirements regarding use or organization are intended only to provide a purpose and audience for the </w:t>
+      </w:r>
+      <w:r>
+        <w:rPr>
+          <w:rFonts w:ascii="Arial" w:hAnsi="Arial" w:cs="Arial"/>
+          <w:sz w:val="28"/>
+          <w:szCs w:val="28"/>
+        </w:rPr>
+        <w:t>model and its documentation</w:t>
+      </w:r>
+      <w:r>
+        <w:rPr>
+          <w:rFonts w:ascii="Arial" w:hAnsi="Arial" w:cs="Arial"/>
+          <w:sz w:val="28"/>
+          <w:szCs w:val="28"/>
+        </w:rPr>
+        <w:t xml:space="preserve">. The user and need may be fabricated. The model must be real. You may start with what the model can do, then construct a user or organization that would benefit from that use. </w:t>
+      </w:r>
+    </w:p>
+    <w:p>
+      <w:pPr>
+        <w:spacing w:before="60" w:after="40"/>
+        <w:rPr>
+          <w:b w:val="1"/>
+          <w:bCs w:val="1"/>
+          <w:color w:val="1F6FB5"/>
+          <w:sz w:val="28"/>
+          <w:szCs w:val="28"/>
+        </w:rPr>
+      </w:pPr>
+    </w:p>
+    <w:p>
+      <w:pPr>
+        <w:pStyle w:val="Heading1"/>
+        <w:spacing w:before="60" w:after="40"/>
+        <w:rPr>
           <w:b w:val="1"/>
           <w:bCs w:val="1"/>
           <w:color w:val="002060"/>
           <w:sz w:val="36"/>
           <w:szCs w:val="36"/>
         </w:rPr>
-        <w:t>Task 1 — Topic Approval Form</w:t>
-      </w:r>
-    </w:p>
-    <w:p>
-      <w:pPr>
-        <w:spacing w:after="60"/>
-        <w:rPr>
-          <w:sz w:val="28"/>
-          <w:szCs w:val="28"/>
-        </w:rPr>
       </w:pPr>
       <w:r>
         <w:rPr>
-          <w:b w:val="1"/>
-          <w:bCs w:val="1"/>
-          <w:sz w:val="28"/>
-          <w:szCs w:val="28"/>
-        </w:rPr>
-        <w:t xml:space="preserve">Purpose. </w:t>
-      </w:r>
-      <w:r>
-        <w:rPr>
-          <w:sz w:val="28"/>
-          <w:szCs w:val="28"/>
-        </w:rPr>
-        <w:t>To confirm a viable topic before Task 2. Approval requires three things: a planned data source, a model derived from that data, and a way for a user to provide input and receive output from the model.</w:t>
-      </w:r>
-    </w:p>
-    <w:p>
-      <w:pPr>
-        <w:spacing w:after="60"/>
-        <w:rPr>
-          <w:sz w:val="28"/>
-          <w:szCs w:val="28"/>
-        </w:rPr>
-      </w:pPr>
-      <w:r>
-        <w:rPr>
-          <w:b w:val="1"/>
-          <w:bCs w:val="1"/>
-          <w:sz w:val="28"/>
-          <w:szCs w:val="28"/>
-        </w:rPr>
-        <w:t xml:space="preserve">The model is the project. </w:t>
-      </w:r>
-      <w:r>
-        <w:rPr>
-          <w:sz w:val="28"/>
-          <w:szCs w:val="28"/>
-        </w:rPr>
-        <w:t>The project must include a model — something whose behavior is shaped by data, such that the application would not work the same way without it. For example, a classifier, a clustering algorithm, a pretrained model, or an ML method.</w:t>
-      </w:r>
-    </w:p>
-    <w:p>
-      <w:pPr>
-        <w:spacing w:after="100"/>
-        <w:rPr>
-          <w:sz w:val="28"/>
-          <w:szCs w:val="28"/>
-        </w:rPr>
-      </w:pPr>
-      <w:r>
-        <w:rPr>
-          <w:b w:val="1"/>
-          <w:bCs w:val="1"/>
-          <w:sz w:val="28"/>
-          <w:szCs w:val="28"/>
-        </w:rPr>
-        <w:t xml:space="preserve">Use determines the user. </w:t>
-      </w:r>
-      <w:r>
-        <w:rPr>
-          <w:sz w:val="28"/>
-          <w:szCs w:val="28"/>
-        </w:rPr>
-        <w:t xml:space="preserve">Other requirements regarding use or organization are intended only to provide a purpose and audience for the </w:t>
-      </w:r>
-      <w:r>
-        <w:rPr>
-          <w:sz w:val="28"/>
-          <w:szCs w:val="28"/>
-        </w:rPr>
-        <w:t>model and its documentation</w:t>
-      </w:r>
-      <w:r>
-        <w:rPr>
-          <w:sz w:val="28"/>
-          <w:szCs w:val="28"/>
-        </w:rPr>
-        <w:t xml:space="preserve">. The user and need may be fabricated. The model must be real. You may start with what the model can do, then construct a user or organization that would benefit from that use. </w:t>
-      </w:r>
-    </w:p>
-    <w:p>
-      <w:pPr>
-        <w:spacing w:before="60" w:after="40"/>
-        <w:rPr>
-          <w:b w:val="1"/>
-          <w:bCs w:val="1"/>
-          <w:color w:val="1F6FB5"/>
-          <w:sz w:val="28"/>
-          <w:szCs w:val="28"/>
-        </w:rPr>
-      </w:pPr>
-    </w:p>
-    <w:p>
-      <w:pPr>
-        <w:spacing w:before="60" w:after="40"/>
-        <w:rPr>
-          <w:b w:val="1"/>
-          <w:bCs w:val="1"/>
-          <w:color w:val="002060"/>
-          <w:sz w:val="36"/>
-          <w:szCs w:val="36"/>
-        </w:rPr>
-      </w:pPr>
-      <w:r>
-        <w:rPr>
-          <w:b w:val="1"/>
-          <w:bCs w:val="1"/>
-          <w:color w:val="002060"/>
-          <w:sz w:val="36"/>
-          <w:szCs w:val="36"/>
+          <w:rFonts w:ascii="Arial" w:hAnsi="Arial" w:cs="Arial"/>
+          <w:color w:val="002855"/>
         </w:rPr>
         <w:t>1.</w:t>
       </w:r>
       <w:r>
         <w:rPr>
-          <w:b w:val="1"/>
-          <w:bCs w:val="1"/>
-          <w:color w:val="002060"/>
-          <w:sz w:val="36"/>
-          <w:szCs w:val="36"/>
+          <w:rFonts w:ascii="Arial" w:hAnsi="Arial" w:cs="Arial"/>
+          <w:color w:val="002855"/>
         </w:rPr>
         <w:t xml:space="preserve"> DATA</w:t>
       </w:r>
@@ -192,6 +191,7 @@
       </w:pPr>
       <w:r>
         <w:rPr>
+          <w:rFonts w:ascii="Arial" w:hAnsi="Arial" w:cs="Arial"/>
           <w:i w:val="1"/>
           <w:iCs w:val="1"/>
           <w:color w:val="595959" w:themeColor="text1" w:themeTint="A6" w:themeShade="FF"/>
@@ -266,6 +266,7 @@
     </w:p>
     <w:p>
       <w:pPr>
+        <w:pStyle w:val="Heading1"/>
         <w:spacing w:before="60" w:after="40"/>
         <w:rPr>
           <w:b w:val="1"/>
@@ -277,11 +278,8 @@
       </w:pPr>
       <w:r>
         <w:rPr>
-          <w:b w:val="1"/>
-          <w:bCs w:val="1"/>
-          <w:color w:val="002060"/>
-          <w:sz w:val="36"/>
-          <w:szCs w:val="36"/>
+          <w:rFonts w:ascii="Arial" w:hAnsi="Arial" w:cs="Arial"/>
+          <w:color w:val="002855"/>
         </w:rPr>
         <w:t>2. MODEL</w:t>
       </w:r>
@@ -299,6 +297,7 @@
       </w:pPr>
       <w:r>
         <w:rPr>
+          <w:rFonts w:ascii="Arial" w:hAnsi="Arial" w:cs="Arial"/>
           <w:i w:val="1"/>
           <w:iCs w:val="1"/>
           <w:color w:val="595959" w:themeColor="text1" w:themeTint="A6" w:themeShade="FF"/>
@@ -309,6 +308,7 @@
       </w:r>
       <w:r>
         <w:rPr>
+          <w:rFonts w:ascii="Arial" w:hAnsi="Arial" w:cs="Arial"/>
           <w:i w:val="1"/>
           <w:iCs w:val="1"/>
           <w:color w:val="595959" w:themeColor="text1" w:themeTint="A6" w:themeShade="FF"/>
@@ -319,6 +319,7 @@
       </w:r>
       <w:r>
         <w:rPr>
+          <w:rFonts w:ascii="Arial" w:hAnsi="Arial" w:cs="Arial"/>
           <w:i w:val="1"/>
           <w:iCs w:val="1"/>
           <w:color w:val="595959" w:themeColor="text1" w:themeTint="A6" w:themeShade="FF"/>
@@ -393,6 +394,7 @@
     </w:p>
     <w:p>
       <w:pPr>
+        <w:pStyle w:val="Heading1"/>
         <w:spacing w:before="60" w:after="40"/>
         <w:rPr>
           <w:b w:val="1"/>
@@ -404,11 +406,8 @@
       </w:pPr>
       <w:r>
         <w:rPr>
-          <w:b w:val="1"/>
-          <w:bCs w:val="1"/>
-          <w:color w:val="002060"/>
-          <w:sz w:val="36"/>
-          <w:szCs w:val="36"/>
+          <w:rFonts w:ascii="Arial" w:hAnsi="Arial" w:cs="Arial"/>
+          <w:color w:val="002855"/>
         </w:rPr>
         <w:t>3. ORGANIZATION AND APPLICATION.</w:t>
       </w:r>
@@ -426,6 +425,7 @@
       </w:pPr>
       <w:r>
         <w:rPr>
+          <w:rFonts w:ascii="Arial" w:hAnsi="Arial" w:cs="Arial"/>
           <w:i w:val="1"/>
           <w:iCs w:val="1"/>
           <w:color w:val="595959" w:themeColor="text1" w:themeTint="A6" w:themeShade="FF"/>
@@ -500,6 +500,7 @@
     </w:p>
     <w:p>
       <w:pPr>
+        <w:pStyle w:val="Heading1"/>
         <w:spacing w:before="60" w:after="40"/>
         <w:rPr>
           <w:b w:val="1"/>
@@ -511,11 +512,8 @@
       </w:pPr>
       <w:r>
         <w:rPr>
-          <w:b w:val="1"/>
-          <w:bCs w:val="1"/>
-          <w:color w:val="002060"/>
-          <w:sz w:val="36"/>
-          <w:szCs w:val="36"/>
+          <w:rFonts w:ascii="Arial" w:hAnsi="Arial" w:cs="Arial"/>
+          <w:color w:val="002855"/>
         </w:rPr>
         <w:t>4. STUDENT CERTIFICATION</w:t>
       </w:r>
@@ -533,6 +531,7 @@
       </w:pPr>
       <w:r>
         <w:rPr>
+          <w:rFonts w:ascii="Arial" w:hAnsi="Arial" w:cs="Arial"/>
           <w:i w:val="1"/>
           <w:iCs w:val="1"/>
           <w:color w:val="595959" w:themeColor="text1" w:themeTint="A6" w:themeShade="FF"/>
@@ -595,6 +594,7 @@
             </w:pPr>
             <w:r>
               <w:rPr>
+                <w:rFonts w:ascii="Arial" w:hAnsi="Arial" w:cs="Arial"/>
                 <w:sz w:val="28"/>
                 <w:szCs w:val="28"/>
               </w:rPr>
@@ -629,6 +629,7 @@
             </w:pPr>
             <w:r>
               <w:rPr>
+                <w:rFonts w:ascii="Arial" w:hAnsi="Arial" w:cs="Arial"/>
                 <w:sz w:val="28"/>
                 <w:szCs w:val="28"/>
               </w:rPr>
@@ -867,6 +868,7 @@
             </w:pPr>
             <w:r>
               <w:rPr>
+                <w:rFonts w:ascii="Arial" w:hAnsi="Arial" w:cs="Arial"/>
                 <w:sz w:val="28"/>
                 <w:szCs w:val="28"/>
               </w:rPr>
@@ -1041,6 +1043,7 @@
             </w:pPr>
             <w:r>
               <w:rPr>
+                <w:rFonts w:ascii="Arial" w:hAnsi="Arial" w:cs="Arial"/>
                 <w:sz w:val="28"/>
                 <w:szCs w:val="28"/>
               </w:rPr>
@@ -1086,6 +1089,10 @@
     <w:sectPr>
       <w:headerReference w:type="default" r:id="rId7"/>
       <w:footerReference w:type="default" r:id="rId8"/>
+      <w:headerReference w:type="first" r:id="rId14"/>
+      <w:footerReference w:type="first" r:id="rId15"/>
+      <w:headerReference w:type="even" r:id="rId16"/>
+      <w:footerReference w:type="even" r:id="rId17"/>
       <w:pgSz w:w="12240" w:h="15840" w:orient="portrait"/>
       <w:pgMar w:top="720" w:right="1080" w:bottom="540" w:left="1080" w:header="708" w:footer="708" w:gutter="0"/>
       <w:cols w:space="720"/>
@@ -1122,6 +1129,7 @@
     </w:pPr>
     <w:r>
       <w:rPr>
+        <w:rFonts w:ascii="Arial" w:hAnsi="Arial" w:cs="Arial"/>
         <w:color w:val="7F7F7F"/>
         <w:sz w:val="18"/>
         <w:szCs w:val="18"/>
@@ -1130,6 +1138,7 @@
     </w:r>
     <w:r>
       <w:rPr>
+        <w:rFonts w:ascii="Arial" w:hAnsi="Arial" w:cs="Arial"/>
         <w:color w:val="7F7F7F"/>
         <w:sz w:val="18"/>
         <w:szCs w:val="18"/>
@@ -1138,6 +1147,7 @@
     </w:r>
     <w:r>
       <w:rPr>
+        <w:rFonts w:ascii="Arial" w:hAnsi="Arial" w:cs="Arial"/>
         <w:color w:val="7F7F7F"/>
         <w:sz w:val="18"/>
         <w:szCs w:val="18"/>
@@ -1146,6 +1156,7 @@
     </w:r>
     <w:r>
       <w:rPr>
+        <w:rFonts w:ascii="Arial" w:hAnsi="Arial" w:cs="Arial"/>
         <w:color w:val="7F7F7F"/>
         <w:sz w:val="18"/>
         <w:szCs w:val="18"/>
@@ -1154,6 +1165,7 @@
     </w:r>
     <w:r>
       <w:rPr>
+        <w:rFonts w:ascii="Arial" w:hAnsi="Arial" w:cs="Arial"/>
         <w:noProof/>
         <w:color w:val="7F7F7F"/>
         <w:sz w:val="18"/>
@@ -1163,6 +1175,7 @@
     </w:r>
     <w:r>
       <w:rPr>
+        <w:rFonts w:ascii="Arial" w:hAnsi="Arial" w:cs="Arial"/>
         <w:color w:val="7F7F7F"/>
         <w:sz w:val="18"/>
         <w:szCs w:val="18"/>
@@ -1171,6 +1184,7 @@
     </w:r>
     <w:r>
       <w:rPr>
+        <w:rFonts w:ascii="Arial" w:hAnsi="Arial" w:cs="Arial"/>
         <w:color w:val="7F7F7F"/>
         <w:sz w:val="18"/>
         <w:szCs w:val="18"/>
@@ -1179,6 +1193,7 @@
     </w:r>
     <w:r>
       <w:rPr>
+        <w:rFonts w:ascii="Arial" w:hAnsi="Arial" w:cs="Arial"/>
         <w:color w:val="7F7F7F"/>
         <w:sz w:val="18"/>
         <w:szCs w:val="18"/>
@@ -1187,6 +1202,7 @@
     </w:r>
     <w:r>
       <w:rPr>
+        <w:rFonts w:ascii="Arial" w:hAnsi="Arial" w:cs="Arial"/>
         <w:color w:val="7F7F7F"/>
         <w:sz w:val="18"/>
         <w:szCs w:val="18"/>
@@ -1195,6 +1211,7 @@
     </w:r>
     <w:r>
       <w:rPr>
+        <w:rFonts w:ascii="Arial" w:hAnsi="Arial" w:cs="Arial"/>
         <w:color w:val="7F7F7F"/>
         <w:sz w:val="18"/>
         <w:szCs w:val="18"/>
@@ -1203,6 +1220,7 @@
     </w:r>
     <w:r>
       <w:rPr>
+        <w:rFonts w:ascii="Arial" w:hAnsi="Arial" w:cs="Arial"/>
         <w:noProof/>
         <w:color w:val="7F7F7F"/>
         <w:sz w:val="18"/>
@@ -1212,12 +1230,33 @@
     </w:r>
     <w:r>
       <w:rPr>
+        <w:rFonts w:ascii="Arial" w:hAnsi="Arial" w:cs="Arial"/>
         <w:color w:val="7F7F7F"/>
         <w:sz w:val="18"/>
         <w:szCs w:val="18"/>
       </w:rPr>
       <w:fldChar w:fldCharType="end"/>
     </w:r>
+  </w:p>
+</w:ftr>
+</file>
+
+<file path=word/footer2.xml><?xml version="1.0" encoding="utf-8"?>
+<w:ftr xmlns:m="http://schemas.openxmlformats.org/officeDocument/2006/math" xmlns:mc="http://schemas.openxmlformats.org/markup-compatibility/2006" xmlns:mo="http://schemas.microsoft.com/office/mac/office/2008/main" xmlns:mv="urn:schemas-microsoft-com:mac:vml" xmlns:o="urn:schemas-microsoft-com:office:office" xmlns:r="http://schemas.openxmlformats.org/officeDocument/2006/relationships" xmlns:v="urn:schemas-microsoft-com:vml" xmlns:w10="urn:schemas-microsoft-com:office:word" xmlns:w14="http://schemas.microsoft.com/office/word/2010/wordml" xmlns:w="http://schemas.openxmlformats.org/wordprocessingml/2006/main" xmlns:wne="http://schemas.microsoft.com/office/word/2006/wordml" xmlns:wp14="http://schemas.microsoft.com/office/word/2010/wordprocessingDrawing" xmlns:wp="http://schemas.openxmlformats.org/drawingml/2006/wordprocessingDrawing" xmlns:wpc="http://schemas.microsoft.com/office/word/2010/wordprocessingCanvas" xmlns:wpg="http://schemas.microsoft.com/office/word/2010/wordprocessingGroup" xmlns:wpi="http://schemas.microsoft.com/office/word/2010/wordprocessingInk" xmlns:wps="http://schemas.microsoft.com/office/word/2010/wordprocessingShape" mc:Ignorable="w14 wp14">
+  <w:p xmlns:wp14="http://schemas.microsoft.com/office/word/2010/wordml" wp14:textId="77777777">
+    <w:pPr>
+      <w:pStyle w:val="Footer"/>
+    </w:pPr>
+  </w:p>
+</w:ftr>
+</file>
+
+<file path=word/footer3.xml><?xml version="1.0" encoding="utf-8"?>
+<w:ftr xmlns:m="http://schemas.openxmlformats.org/officeDocument/2006/math" xmlns:mc="http://schemas.openxmlformats.org/markup-compatibility/2006" xmlns:mo="http://schemas.microsoft.com/office/mac/office/2008/main" xmlns:mv="urn:schemas-microsoft-com:mac:vml" xmlns:o="urn:schemas-microsoft-com:office:office" xmlns:r="http://schemas.openxmlformats.org/officeDocument/2006/relationships" xmlns:v="urn:schemas-microsoft-com:vml" xmlns:w10="urn:schemas-microsoft-com:office:word" xmlns:w14="http://schemas.microsoft.com/office/word/2010/wordml" xmlns:w="http://schemas.openxmlformats.org/wordprocessingml/2006/main" xmlns:wne="http://schemas.microsoft.com/office/word/2006/wordml" xmlns:wp14="http://schemas.microsoft.com/office/word/2010/wordprocessingDrawing" xmlns:wp="http://schemas.openxmlformats.org/drawingml/2006/wordprocessingDrawing" xmlns:wpc="http://schemas.microsoft.com/office/word/2010/wordprocessingCanvas" xmlns:wpg="http://schemas.microsoft.com/office/word/2010/wordprocessingGroup" xmlns:wpi="http://schemas.microsoft.com/office/word/2010/wordprocessingInk" xmlns:wps="http://schemas.microsoft.com/office/word/2010/wordprocessingShape" mc:Ignorable="w14 wp14">
+  <w:p xmlns:wp14="http://schemas.microsoft.com/office/word/2010/wordml" wp14:textId="77777777">
+    <w:pPr>
+      <w:pStyle w:val="Footer"/>
+    </w:pPr>
   </w:p>
 </w:ftr>
 </file>
@@ -1249,6 +1288,7 @@
     </w:pPr>
     <w:r>
       <w:rPr>
+        <w:rFonts w:ascii="Arial" w:hAnsi="Arial" w:cs="Arial"/>
         <w:i/>
         <w:iCs/>
         <w:color w:val="7F7F7F"/>
@@ -1257,6 +1297,26 @@
       </w:rPr>
       <w:t>C964 — Computer Science Capstone Topic Approval (Task 1)</w:t>
     </w:r>
+  </w:p>
+</w:hdr>
+</file>
+
+<file path=word/header2.xml><?xml version="1.0" encoding="utf-8"?>
+<w:hdr xmlns:m="http://schemas.openxmlformats.org/officeDocument/2006/math" xmlns:mc="http://schemas.openxmlformats.org/markup-compatibility/2006" xmlns:mo="http://schemas.microsoft.com/office/mac/office/2008/main" xmlns:mv="urn:schemas-microsoft-com:mac:vml" xmlns:o="urn:schemas-microsoft-com:office:office" xmlns:r="http://schemas.openxmlformats.org/officeDocument/2006/relationships" xmlns:v="urn:schemas-microsoft-com:vml" xmlns:w10="urn:schemas-microsoft-com:office:word" xmlns:w14="http://schemas.microsoft.com/office/word/2010/wordml" xmlns:w="http://schemas.openxmlformats.org/wordprocessingml/2006/main" xmlns:wne="http://schemas.microsoft.com/office/word/2006/wordml" xmlns:wp14="http://schemas.microsoft.com/office/word/2010/wordprocessingDrawing" xmlns:wp="http://schemas.openxmlformats.org/drawingml/2006/wordprocessingDrawing" xmlns:wpc="http://schemas.microsoft.com/office/word/2010/wordprocessingCanvas" xmlns:wpg="http://schemas.microsoft.com/office/word/2010/wordprocessingGroup" xmlns:wpi="http://schemas.microsoft.com/office/word/2010/wordprocessingInk" xmlns:wps="http://schemas.microsoft.com/office/word/2010/wordprocessingShape" mc:Ignorable="w14 wp14">
+  <w:p xmlns:wp14="http://schemas.microsoft.com/office/word/2010/wordml" wp14:textId="77777777">
+    <w:pPr>
+      <w:pStyle w:val="Header"/>
+    </w:pPr>
+  </w:p>
+</w:hdr>
+</file>
+
+<file path=word/header3.xml><?xml version="1.0" encoding="utf-8"?>
+<w:hdr xmlns:m="http://schemas.openxmlformats.org/officeDocument/2006/math" xmlns:mc="http://schemas.openxmlformats.org/markup-compatibility/2006" xmlns:mo="http://schemas.microsoft.com/office/mac/office/2008/main" xmlns:mv="urn:schemas-microsoft-com:mac:vml" xmlns:o="urn:schemas-microsoft-com:office:office" xmlns:r="http://schemas.openxmlformats.org/officeDocument/2006/relationships" xmlns:v="urn:schemas-microsoft-com:vml" xmlns:w10="urn:schemas-microsoft-com:office:word" xmlns:w14="http://schemas.microsoft.com/office/word/2010/wordml" xmlns:w="http://schemas.openxmlformats.org/wordprocessingml/2006/main" xmlns:wne="http://schemas.microsoft.com/office/word/2006/wordml" xmlns:wp14="http://schemas.microsoft.com/office/word/2010/wordprocessingDrawing" xmlns:wp="http://schemas.openxmlformats.org/drawingml/2006/wordprocessingDrawing" xmlns:wpc="http://schemas.microsoft.com/office/word/2010/wordprocessingCanvas" xmlns:wpg="http://schemas.microsoft.com/office/word/2010/wordprocessingGroup" xmlns:wpi="http://schemas.microsoft.com/office/word/2010/wordprocessingInk" xmlns:wps="http://schemas.microsoft.com/office/word/2010/wordprocessingShape" mc:Ignorable="w14 wp14">
+  <w:p xmlns:wp14="http://schemas.microsoft.com/office/word/2010/wordml" wp14:textId="77777777">
+    <w:pPr>
+      <w:pStyle w:val="Header"/>
+    </w:pPr>
   </w:p>
 </w:hdr>
 </file>
@@ -1535,7 +1595,7 @@
 </file>
 
 <file path=word/styles.xml><?xml version="1.0" encoding="utf-8"?>
-<w:styles xmlns:mc="http://schemas.openxmlformats.org/markup-compatibility/2006" xmlns:r="http://schemas.openxmlformats.org/officeDocument/2006/relationships" xmlns:w="http://schemas.openxmlformats.org/wordprocessingml/2006/main" xmlns:w14="http://schemas.microsoft.com/office/word/2010/wordml" xmlns:w15="http://schemas.microsoft.com/office/word/2012/wordml" xmlns:w16cex="http://schemas.microsoft.com/office/word/2018/wordml/cex" xmlns:w16cid="http://schemas.microsoft.com/office/word/2016/wordml/cid" xmlns:w16="http://schemas.microsoft.com/office/word/2018/wordml" xmlns:w16du="http://schemas.microsoft.com/office/word/2023/wordml/word16du" xmlns:w16sdtdh="http://schemas.microsoft.com/office/word/2020/wordml/sdtdatahash" xmlns:w16sdtfl="http://schemas.microsoft.com/office/word/2024/wordml/sdtformatlock" xmlns:w16se="http://schemas.microsoft.com/office/word/2015/wordml/symex" mc:Ignorable="w14 w15 w16se w16cid w16 w16cex w16sdtdh w16sdtfl w16du">
+<w:styles xmlns:wp14="http://schemas.microsoft.com/office/word/2010/wordprocessingDrawing" xmlns:mc="http://schemas.openxmlformats.org/markup-compatibility/2006" xmlns:r="http://schemas.openxmlformats.org/officeDocument/2006/relationships" xmlns:w="http://schemas.openxmlformats.org/wordprocessingml/2006/main" xmlns:w14="http://schemas.microsoft.com/office/word/2010/wordml" xmlns:w15="http://schemas.microsoft.com/office/word/2012/wordml" xmlns:w16cex="http://schemas.microsoft.com/office/word/2018/wordml/cex" xmlns:w16cid="http://schemas.microsoft.com/office/word/2016/wordml/cid" xmlns:w16="http://schemas.microsoft.com/office/word/2018/wordml" xmlns:w16du="http://schemas.microsoft.com/office/word/2023/wordml/word16du" xmlns:w16sdtdh="http://schemas.microsoft.com/office/word/2020/wordml/sdtdatahash" xmlns:w16sdtfl="http://schemas.microsoft.com/office/word/2024/wordml/sdtformatlock" xmlns:w16se="http://schemas.microsoft.com/office/word/2015/wordml/symex" mc:Ignorable="w14 w15 w16se w16cid w16 w16cex w16sdtdh w16sdtfl w16du wp14">
   <w:docDefaults>
     <w:rPrDefault>
       <w:rPr>
@@ -1928,6 +1988,11 @@
   <w:style w:type="paragraph" w:styleId="Normal" w:default="1">
     <w:name w:val="Normal"/>
     <w:qFormat/>
+    <w:rPr>
+      <w:rFonts w:ascii="Arial" w:hAnsi="Arial" w:cs="Arial"/>
+      <w:color w:val="000000"/>
+      <w:sz w:val="28"/>
+    </w:rPr>
   </w:style>
   <w:style w:type="paragraph" w:styleId="Heading1">
     <w:name w:val="heading 1"/>
@@ -1937,8 +2002,10 @@
       <w:outlineLvl w:val="0"/>
     </w:pPr>
     <w:rPr>
-      <w:color w:val="2E74B5"/>
-      <w:sz w:val="32"/>
+      <w:rFonts w:ascii="Arial" w:hAnsi="Arial"/>
+      <w:b/>
+      <w:color w:val="002855"/>
+      <w:sz w:val="48"/>
       <w:szCs w:val="32"/>
     </w:rPr>
   </w:style>
@@ -1952,8 +2019,10 @@
       <w:outlineLvl w:val="1"/>
     </w:pPr>
     <w:rPr>
-      <w:color w:val="2E74B5"/>
-      <w:sz w:val="26"/>
+      <w:rFonts w:ascii="Arial" w:hAnsi="Arial"/>
+      <w:b/>
+      <w:color w:val="002855"/>
+      <w:sz w:val="44"/>
       <w:szCs w:val="26"/>
     </w:rPr>
   </w:style>
@@ -1967,8 +2036,10 @@
       <w:outlineLvl w:val="2"/>
     </w:pPr>
     <w:rPr>
-      <w:color w:val="1F4D78"/>
-      <w:sz w:val="24"/>
+      <w:rFonts w:ascii="Arial" w:hAnsi="Arial"/>
+      <w:b/>
+      <w:color w:val="002855"/>
+      <w:sz w:val="36"/>
       <w:szCs w:val="24"/>
     </w:rPr>
   </w:style>
@@ -1982,9 +2053,12 @@
       <w:outlineLvl w:val="3"/>
     </w:pPr>
     <w:rPr>
+      <w:rFonts w:ascii="Arial" w:hAnsi="Arial"/>
+      <w:b/>
       <w:i/>
       <w:iCs/>
-      <w:color w:val="2E74B5"/>
+      <w:color w:val="002855"/>
+      <w:sz w:val="28"/>
     </w:rPr>
   </w:style>
   <w:style w:type="paragraph" w:styleId="Heading5">
@@ -2045,7 +2119,10 @@
     <w:uiPriority w:val="10"/>
     <w:qFormat/>
     <w:rPr>
-      <w:sz w:val="56"/>
+      <w:rFonts w:ascii="Arial" w:hAnsi="Arial"/>
+      <w:b/>
+      <w:color w:val="002855"/>
+      <w:sz w:val="64"/>
       <w:szCs w:val="56"/>
     </w:rPr>
   </w:style>
@@ -2066,7 +2143,7 @@
     <w:uiPriority w:val="99"/>
     <w:unhideWhenUsed/>
     <w:rPr>
-      <w:color w:val="0563C1"/>
+      <w:color w:val="46B1EF"/>
       <w:u w:val="single"/>
     </w:rPr>
   </w:style>
@@ -2451,9 +2528,10 @@
 </file>
 
 <file path=customXml/item1.xml><?xml version="1.0" encoding="utf-8"?>
-<ct:contentTypeSchema xmlns:ct="http://schemas.microsoft.com/office/2006/metadata/contentType" xmlns:ma="http://schemas.microsoft.com/office/2006/metadata/properties/metaAttributes" ct:_="" ma:_="" ma:contentTypeName="Document" ma:contentTypeID="0x010100BD6C6811FDA4354DADCD440B75A43D37" ma:contentTypeVersion="3" ma:contentTypeDescription="Create a new document." ma:contentTypeScope="" ma:versionID="cca1146c5ddd7f7207d93b53ec4b7890">
-  <xsd:schema xmlns:xsd="http://www.w3.org/2001/XMLSchema" xmlns:xs="http://www.w3.org/2001/XMLSchema" xmlns:p="http://schemas.microsoft.com/office/2006/metadata/properties" xmlns:ns2="c340dd69-6dcb-4f68-be59-83f5ced86ed4" targetNamespace="http://schemas.microsoft.com/office/2006/metadata/properties" ma:root="true" ma:fieldsID="0b09d8cc436d6a436f5197c02775f266" ns2:_="">
+<ct:contentTypeSchema xmlns:ct="http://schemas.microsoft.com/office/2006/metadata/contentType" xmlns:ma="http://schemas.microsoft.com/office/2006/metadata/properties/metaAttributes" ct:_="" ma:_="" ma:contentTypeName="Document" ma:contentTypeID="0x010100BD6C6811FDA4354DADCD440B75A43D37" ma:contentTypeVersion="11" ma:contentTypeDescription="Create a new document." ma:contentTypeScope="" ma:versionID="a91333966e9b5d4bdd13b64d2abe3577">
+  <xsd:schema xmlns:xsd="http://www.w3.org/2001/XMLSchema" xmlns:xs="http://www.w3.org/2001/XMLSchema" xmlns:p="http://schemas.microsoft.com/office/2006/metadata/properties" xmlns:ns2="c340dd69-6dcb-4f68-be59-83f5ced86ed4" xmlns:ns3="90ab80b9-a678-4acf-968e-12ab5f1680e1" targetNamespace="http://schemas.microsoft.com/office/2006/metadata/properties" ma:root="true" ma:fieldsID="515f04c4260719a37f25d194220eca20" ns2:_="" ns3:_="">
     <xsd:import namespace="c340dd69-6dcb-4f68-be59-83f5ced86ed4"/>
+    <xsd:import namespace="90ab80b9-a678-4acf-968e-12ab5f1680e1"/>
     <xsd:element name="properties">
       <xsd:complexType>
         <xsd:sequence>
@@ -2463,6 +2541,13 @@
                 <xsd:element ref="ns2:MediaServiceMetadata" minOccurs="0"/>
                 <xsd:element ref="ns2:MediaServiceFastMetadata" minOccurs="0"/>
                 <xsd:element ref="ns2:MediaServiceSearchProperties" minOccurs="0"/>
+                <xsd:element ref="ns2:MediaServiceDateTaken" minOccurs="0"/>
+                <xsd:element ref="ns2:MediaServiceGenerationTime" minOccurs="0"/>
+                <xsd:element ref="ns2:MediaServiceEventHashCode" minOccurs="0"/>
+                <xsd:element ref="ns2:MediaLengthInSeconds" minOccurs="0"/>
+                <xsd:element ref="ns2:lcf76f155ced4ddcb4097134ff3c332f" minOccurs="0"/>
+                <xsd:element ref="ns3:TaxCatchAll" minOccurs="0"/>
+                <xsd:element ref="ns2:MediaServiceOCR" minOccurs="0"/>
               </xsd:all>
             </xsd:complexType>
           </xsd:element>
@@ -2487,6 +2572,55 @@
       <xsd:simpleType>
         <xsd:restriction base="dms:Note"/>
       </xsd:simpleType>
+    </xsd:element>
+    <xsd:element name="MediaServiceDateTaken" ma:index="11" nillable="true" ma:displayName="MediaServiceDateTaken" ma:hidden="true" ma:indexed="true" ma:internalName="MediaServiceDateTaken" ma:readOnly="true">
+      <xsd:simpleType>
+        <xsd:restriction base="dms:Text"/>
+      </xsd:simpleType>
+    </xsd:element>
+    <xsd:element name="MediaServiceGenerationTime" ma:index="12" nillable="true" ma:displayName="MediaServiceGenerationTime" ma:hidden="true" ma:internalName="MediaServiceGenerationTime" ma:readOnly="true">
+      <xsd:simpleType>
+        <xsd:restriction base="dms:Text"/>
+      </xsd:simpleType>
+    </xsd:element>
+    <xsd:element name="MediaServiceEventHashCode" ma:index="13" nillable="true" ma:displayName="MediaServiceEventHashCode" ma:hidden="true" ma:internalName="MediaServiceEventHashCode" ma:readOnly="true">
+      <xsd:simpleType>
+        <xsd:restriction base="dms:Text"/>
+      </xsd:simpleType>
+    </xsd:element>
+    <xsd:element name="MediaLengthInSeconds" ma:index="14" nillable="true" ma:displayName="MediaLengthInSeconds" ma:hidden="true" ma:internalName="MediaLengthInSeconds" ma:readOnly="true">
+      <xsd:simpleType>
+        <xsd:restriction base="dms:Unknown"/>
+      </xsd:simpleType>
+    </xsd:element>
+    <xsd:element name="lcf76f155ced4ddcb4097134ff3c332f" ma:index="16" nillable="true" ma:taxonomy="true" ma:internalName="lcf76f155ced4ddcb4097134ff3c332f" ma:taxonomyFieldName="MediaServiceImageTags" ma:displayName="Image Tags" ma:readOnly="false" ma:fieldId="{5cf76f15-5ced-4ddc-b409-7134ff3c332f}" ma:taxonomyMulti="true" ma:sspId="acb2b71a-ac8b-4347-9f63-f75d234e2459" ma:termSetId="09814cd3-568e-fe90-9814-8d621ff8fb84" ma:anchorId="fba54fb3-c3e1-fe81-a776-ca4b69148c4d" ma:open="true" ma:isKeyword="false">
+      <xsd:complexType>
+        <xsd:sequence>
+          <xsd:element ref="pc:Terms" minOccurs="0" maxOccurs="1"/>
+        </xsd:sequence>
+      </xsd:complexType>
+    </xsd:element>
+    <xsd:element name="MediaServiceOCR" ma:index="18" nillable="true" ma:displayName="Extracted Text" ma:internalName="MediaServiceOCR" ma:readOnly="true">
+      <xsd:simpleType>
+        <xsd:restriction base="dms:Note">
+          <xsd:maxLength value="255"/>
+        </xsd:restriction>
+      </xsd:simpleType>
+    </xsd:element>
+  </xsd:schema>
+  <xsd:schema xmlns:xsd="http://www.w3.org/2001/XMLSchema" xmlns:xs="http://www.w3.org/2001/XMLSchema" xmlns:dms="http://schemas.microsoft.com/office/2006/documentManagement/types" xmlns:pc="http://schemas.microsoft.com/office/infopath/2007/PartnerControls" targetNamespace="90ab80b9-a678-4acf-968e-12ab5f1680e1" elementFormDefault="qualified">
+    <xsd:import namespace="http://schemas.microsoft.com/office/2006/documentManagement/types"/>
+    <xsd:import namespace="http://schemas.microsoft.com/office/infopath/2007/PartnerControls"/>
+    <xsd:element name="TaxCatchAll" ma:index="17" nillable="true" ma:displayName="Taxonomy Catch All Column" ma:hidden="true" ma:list="{91cc3007-8d51-4721-bdcb-fe3999517373}" ma:internalName="TaxCatchAll" ma:showField="CatchAllData" ma:web="90ab80b9-a678-4acf-968e-12ab5f1680e1">
+      <xsd:complexType>
+        <xsd:complexContent>
+          <xsd:extension base="dms:MultiChoiceLookup">
+            <xsd:sequence>
+              <xsd:element name="Value" type="dms:Lookup" maxOccurs="unbounded" minOccurs="0" nillable="true"/>
+            </xsd:sequence>
+          </xsd:extension>
+        </xsd:complexContent>
+      </xsd:complexType>
     </xsd:element>
   </xsd:schema>
   <xsd:schema xmlns="http://schemas.openxmlformats.org/package/2006/metadata/core-properties" xmlns:xsd="http://www.w3.org/2001/XMLSchema" xmlns:xsi="http://www.w3.org/2001/XMLSchema-instance" xmlns:dc="http://purl.org/dc/elements/1.1/" xmlns:dcterms="http://purl.org/dc/terms/" xmlns:odoc="http://schemas.microsoft.com/internal/obd" targetNamespace="http://schemas.openxmlformats.org/package/2006/metadata/core-properties" elementFormDefault="qualified" attributeFormDefault="unqualified" blockDefault="#all">
@@ -2599,12 +2733,17 @@
 
 <file path=customXml/item3.xml><?xml version="1.0" encoding="utf-8"?>
 <p:properties xmlns:p="http://schemas.microsoft.com/office/2006/metadata/properties" xmlns:xsi="http://www.w3.org/2001/XMLSchema-instance" xmlns:pc="http://schemas.microsoft.com/office/infopath/2007/PartnerControls">
-  <documentManagement/>
+  <documentManagement>
+    <lcf76f155ced4ddcb4097134ff3c332f xmlns="c340dd69-6dcb-4f68-be59-83f5ced86ed4">
+      <Terms xmlns="http://schemas.microsoft.com/office/infopath/2007/PartnerControls"/>
+    </lcf76f155ced4ddcb4097134ff3c332f>
+    <TaxCatchAll xmlns="90ab80b9-a678-4acf-968e-12ab5f1680e1" xsi:nil="true"/>
+  </documentManagement>
 </p:properties>
 </file>
 
 <file path=customXml/itemProps1.xml><?xml version="1.0" encoding="utf-8"?>
-<ds:datastoreItem xmlns:ds="http://schemas.openxmlformats.org/officeDocument/2006/customXml" ds:itemID="{4136C733-11A2-49B7-A540-48F18DDD01AA}"/>
+<ds:datastoreItem xmlns:ds="http://schemas.openxmlformats.org/officeDocument/2006/customXml" ds:itemID="{45FF6206-194D-4AF1-BEE4-7D584DD2BC2E}"/>
 </file>
 
 <file path=customXml/itemProps2.xml><?xml version="1.0" encoding="utf-8"?>

</xml_diff>

<commit_message>
fixed rgreessions. Now updated to include Task 1 new policy. Added notificaitons about examples using old forms'
</commit_message>
<xml_diff>
--- a/resources/C964_Task1_Approval_Form.docx
+++ b/resources/C964_Task1_Approval_Form.docx
@@ -4,7 +4,6 @@
   <w:body>
     <w:p>
       <w:pPr>
-        <w:pStyle w:val="Title"/>
         <w:spacing w:after="60"/>
         <w:rPr>
           <w:b w:val="1"/>
@@ -16,15 +15,17 @@
       </w:pPr>
       <w:r>
         <w:rPr>
-          <w:rFonts w:ascii="Arial" w:hAnsi="Arial" w:cs="Arial"/>
-          <w:color w:val="002855"/>
+          <w:b w:val="1"/>
+          <w:bCs w:val="1"/>
+          <w:color w:val="002060"/>
+          <w:sz w:val="44"/>
+          <w:szCs w:val="44"/>
         </w:rPr>
         <w:t>C964 Computer Science Capstone</w:t>
       </w:r>
     </w:p>
     <w:p>
       <w:pPr>
-        <w:pStyle w:val="Heading1"/>
         <w:spacing w:after="160"/>
         <w:rPr>
           <w:b w:val="1"/>
@@ -36,8 +37,11 @@
       </w:pPr>
       <w:r>
         <w:rPr>
-          <w:rFonts w:ascii="Arial" w:hAnsi="Arial" w:cs="Arial"/>
-          <w:color w:val="002855"/>
+          <w:b w:val="1"/>
+          <w:bCs w:val="1"/>
+          <w:color w:val="002060"/>
+          <w:sz w:val="36"/>
+          <w:szCs w:val="36"/>
         </w:rPr>
         <w:t>Task 1 — Topic Approval Form</w:t>
       </w:r>
@@ -52,7 +56,6 @@
       </w:pPr>
       <w:r>
         <w:rPr>
-          <w:rFonts w:ascii="Arial" w:hAnsi="Arial" w:cs="Arial"/>
           <w:b w:val="1"/>
           <w:bCs w:val="1"/>
           <w:sz w:val="28"/>
@@ -62,7 +65,6 @@
       </w:r>
       <w:r>
         <w:rPr>
-          <w:rFonts w:ascii="Arial" w:hAnsi="Arial" w:cs="Arial"/>
           <w:sz w:val="28"/>
           <w:szCs w:val="28"/>
         </w:rPr>
@@ -79,7 +81,6 @@
       </w:pPr>
       <w:r>
         <w:rPr>
-          <w:rFonts w:ascii="Arial" w:hAnsi="Arial" w:cs="Arial"/>
           <w:b w:val="1"/>
           <w:bCs w:val="1"/>
           <w:sz w:val="28"/>
@@ -89,7 +90,6 @@
       </w:r>
       <w:r>
         <w:rPr>
-          <w:rFonts w:ascii="Arial" w:hAnsi="Arial" w:cs="Arial"/>
           <w:sz w:val="28"/>
           <w:szCs w:val="28"/>
         </w:rPr>
@@ -106,7 +106,6 @@
       </w:pPr>
       <w:r>
         <w:rPr>
-          <w:rFonts w:ascii="Arial" w:hAnsi="Arial" w:cs="Arial"/>
           <w:b w:val="1"/>
           <w:bCs w:val="1"/>
           <w:sz w:val="28"/>
@@ -116,7 +115,6 @@
       </w:r>
       <w:r>
         <w:rPr>
-          <w:rFonts w:ascii="Arial" w:hAnsi="Arial" w:cs="Arial"/>
           <w:sz w:val="28"/>
           <w:szCs w:val="28"/>
         </w:rPr>
@@ -124,7 +122,6 @@
       </w:r>
       <w:r>
         <w:rPr>
-          <w:rFonts w:ascii="Arial" w:hAnsi="Arial" w:cs="Arial"/>
           <w:sz w:val="28"/>
           <w:szCs w:val="28"/>
         </w:rPr>
@@ -132,7 +129,6 @@
       </w:r>
       <w:r>
         <w:rPr>
-          <w:rFonts w:ascii="Arial" w:hAnsi="Arial" w:cs="Arial"/>
           <w:sz w:val="28"/>
           <w:szCs w:val="28"/>
         </w:rPr>
@@ -153,7 +149,6 @@
     </w:p>
     <w:p>
       <w:pPr>
-        <w:pStyle w:val="Heading1"/>
         <w:spacing w:before="60" w:after="40"/>
         <w:rPr>
           <w:b w:val="1"/>
@@ -165,15 +160,21 @@
       </w:pPr>
       <w:r>
         <w:rPr>
-          <w:rFonts w:ascii="Arial" w:hAnsi="Arial" w:cs="Arial"/>
-          <w:color w:val="002855"/>
+          <w:b w:val="1"/>
+          <w:bCs w:val="1"/>
+          <w:color w:val="002060"/>
+          <w:sz w:val="36"/>
+          <w:szCs w:val="36"/>
         </w:rPr>
         <w:t>1.</w:t>
       </w:r>
       <w:r>
         <w:rPr>
-          <w:rFonts w:ascii="Arial" w:hAnsi="Arial" w:cs="Arial"/>
-          <w:color w:val="002855"/>
+          <w:b w:val="1"/>
+          <w:bCs w:val="1"/>
+          <w:color w:val="002060"/>
+          <w:sz w:val="36"/>
+          <w:szCs w:val="36"/>
         </w:rPr>
         <w:t xml:space="preserve"> DATA</w:t>
       </w:r>
@@ -191,7 +192,6 @@
       </w:pPr>
       <w:r>
         <w:rPr>
-          <w:rFonts w:ascii="Arial" w:hAnsi="Arial" w:cs="Arial"/>
           <w:i w:val="1"/>
           <w:iCs w:val="1"/>
           <w:color w:val="595959" w:themeColor="text1" w:themeTint="A6" w:themeShade="FF"/>
@@ -266,7 +266,6 @@
     </w:p>
     <w:p>
       <w:pPr>
-        <w:pStyle w:val="Heading1"/>
         <w:spacing w:before="60" w:after="40"/>
         <w:rPr>
           <w:b w:val="1"/>
@@ -278,8 +277,11 @@
       </w:pPr>
       <w:r>
         <w:rPr>
-          <w:rFonts w:ascii="Arial" w:hAnsi="Arial" w:cs="Arial"/>
-          <w:color w:val="002855"/>
+          <w:b w:val="1"/>
+          <w:bCs w:val="1"/>
+          <w:color w:val="002060"/>
+          <w:sz w:val="36"/>
+          <w:szCs w:val="36"/>
         </w:rPr>
         <w:t>2. MODEL</w:t>
       </w:r>
@@ -297,7 +299,6 @@
       </w:pPr>
       <w:r>
         <w:rPr>
-          <w:rFonts w:ascii="Arial" w:hAnsi="Arial" w:cs="Arial"/>
           <w:i w:val="1"/>
           <w:iCs w:val="1"/>
           <w:color w:val="595959" w:themeColor="text1" w:themeTint="A6" w:themeShade="FF"/>
@@ -308,7 +309,6 @@
       </w:r>
       <w:r>
         <w:rPr>
-          <w:rFonts w:ascii="Arial" w:hAnsi="Arial" w:cs="Arial"/>
           <w:i w:val="1"/>
           <w:iCs w:val="1"/>
           <w:color w:val="595959" w:themeColor="text1" w:themeTint="A6" w:themeShade="FF"/>
@@ -319,7 +319,6 @@
       </w:r>
       <w:r>
         <w:rPr>
-          <w:rFonts w:ascii="Arial" w:hAnsi="Arial" w:cs="Arial"/>
           <w:i w:val="1"/>
           <w:iCs w:val="1"/>
           <w:color w:val="595959" w:themeColor="text1" w:themeTint="A6" w:themeShade="FF"/>
@@ -394,7 +393,6 @@
     </w:p>
     <w:p>
       <w:pPr>
-        <w:pStyle w:val="Heading1"/>
         <w:spacing w:before="60" w:after="40"/>
         <w:rPr>
           <w:b w:val="1"/>
@@ -406,8 +404,11 @@
       </w:pPr>
       <w:r>
         <w:rPr>
-          <w:rFonts w:ascii="Arial" w:hAnsi="Arial" w:cs="Arial"/>
-          <w:color w:val="002855"/>
+          <w:b w:val="1"/>
+          <w:bCs w:val="1"/>
+          <w:color w:val="002060"/>
+          <w:sz w:val="36"/>
+          <w:szCs w:val="36"/>
         </w:rPr>
         <w:t>3. ORGANIZATION AND APPLICATION.</w:t>
       </w:r>
@@ -425,7 +426,6 @@
       </w:pPr>
       <w:r>
         <w:rPr>
-          <w:rFonts w:ascii="Arial" w:hAnsi="Arial" w:cs="Arial"/>
           <w:i w:val="1"/>
           <w:iCs w:val="1"/>
           <w:color w:val="595959" w:themeColor="text1" w:themeTint="A6" w:themeShade="FF"/>
@@ -500,7 +500,6 @@
     </w:p>
     <w:p>
       <w:pPr>
-        <w:pStyle w:val="Heading1"/>
         <w:spacing w:before="60" w:after="40"/>
         <w:rPr>
           <w:b w:val="1"/>
@@ -512,8 +511,11 @@
       </w:pPr>
       <w:r>
         <w:rPr>
-          <w:rFonts w:ascii="Arial" w:hAnsi="Arial" w:cs="Arial"/>
-          <w:color w:val="002855"/>
+          <w:b w:val="1"/>
+          <w:bCs w:val="1"/>
+          <w:color w:val="002060"/>
+          <w:sz w:val="36"/>
+          <w:szCs w:val="36"/>
         </w:rPr>
         <w:t>4. STUDENT CERTIFICATION</w:t>
       </w:r>
@@ -531,7 +533,6 @@
       </w:pPr>
       <w:r>
         <w:rPr>
-          <w:rFonts w:ascii="Arial" w:hAnsi="Arial" w:cs="Arial"/>
           <w:i w:val="1"/>
           <w:iCs w:val="1"/>
           <w:color w:val="595959" w:themeColor="text1" w:themeTint="A6" w:themeShade="FF"/>
@@ -594,7 +595,6 @@
             </w:pPr>
             <w:r>
               <w:rPr>
-                <w:rFonts w:ascii="Arial" w:hAnsi="Arial" w:cs="Arial"/>
                 <w:sz w:val="28"/>
                 <w:szCs w:val="28"/>
               </w:rPr>
@@ -629,7 +629,6 @@
             </w:pPr>
             <w:r>
               <w:rPr>
-                <w:rFonts w:ascii="Arial" w:hAnsi="Arial" w:cs="Arial"/>
                 <w:sz w:val="28"/>
                 <w:szCs w:val="28"/>
               </w:rPr>
@@ -868,7 +867,6 @@
             </w:pPr>
             <w:r>
               <w:rPr>
-                <w:rFonts w:ascii="Arial" w:hAnsi="Arial" w:cs="Arial"/>
                 <w:sz w:val="28"/>
                 <w:szCs w:val="28"/>
               </w:rPr>
@@ -1043,7 +1041,6 @@
             </w:pPr>
             <w:r>
               <w:rPr>
-                <w:rFonts w:ascii="Arial" w:hAnsi="Arial" w:cs="Arial"/>
                 <w:sz w:val="28"/>
                 <w:szCs w:val="28"/>
               </w:rPr>
@@ -1089,10 +1086,6 @@
     <w:sectPr>
       <w:headerReference w:type="default" r:id="rId7"/>
       <w:footerReference w:type="default" r:id="rId8"/>
-      <w:headerReference w:type="first" r:id="rId14"/>
-      <w:footerReference w:type="first" r:id="rId15"/>
-      <w:headerReference w:type="even" r:id="rId16"/>
-      <w:footerReference w:type="even" r:id="rId17"/>
       <w:pgSz w:w="12240" w:h="15840" w:orient="portrait"/>
       <w:pgMar w:top="720" w:right="1080" w:bottom="540" w:left="1080" w:header="708" w:footer="708" w:gutter="0"/>
       <w:cols w:space="720"/>
@@ -1129,7 +1122,6 @@
     </w:pPr>
     <w:r>
       <w:rPr>
-        <w:rFonts w:ascii="Arial" w:hAnsi="Arial" w:cs="Arial"/>
         <w:color w:val="7F7F7F"/>
         <w:sz w:val="18"/>
         <w:szCs w:val="18"/>
@@ -1138,7 +1130,6 @@
     </w:r>
     <w:r>
       <w:rPr>
-        <w:rFonts w:ascii="Arial" w:hAnsi="Arial" w:cs="Arial"/>
         <w:color w:val="7F7F7F"/>
         <w:sz w:val="18"/>
         <w:szCs w:val="18"/>
@@ -1147,7 +1138,6 @@
     </w:r>
     <w:r>
       <w:rPr>
-        <w:rFonts w:ascii="Arial" w:hAnsi="Arial" w:cs="Arial"/>
         <w:color w:val="7F7F7F"/>
         <w:sz w:val="18"/>
         <w:szCs w:val="18"/>
@@ -1156,7 +1146,6 @@
     </w:r>
     <w:r>
       <w:rPr>
-        <w:rFonts w:ascii="Arial" w:hAnsi="Arial" w:cs="Arial"/>
         <w:color w:val="7F7F7F"/>
         <w:sz w:val="18"/>
         <w:szCs w:val="18"/>
@@ -1165,7 +1154,6 @@
     </w:r>
     <w:r>
       <w:rPr>
-        <w:rFonts w:ascii="Arial" w:hAnsi="Arial" w:cs="Arial"/>
         <w:noProof/>
         <w:color w:val="7F7F7F"/>
         <w:sz w:val="18"/>
@@ -1175,7 +1163,6 @@
     </w:r>
     <w:r>
       <w:rPr>
-        <w:rFonts w:ascii="Arial" w:hAnsi="Arial" w:cs="Arial"/>
         <w:color w:val="7F7F7F"/>
         <w:sz w:val="18"/>
         <w:szCs w:val="18"/>
@@ -1184,7 +1171,6 @@
     </w:r>
     <w:r>
       <w:rPr>
-        <w:rFonts w:ascii="Arial" w:hAnsi="Arial" w:cs="Arial"/>
         <w:color w:val="7F7F7F"/>
         <w:sz w:val="18"/>
         <w:szCs w:val="18"/>
@@ -1193,7 +1179,6 @@
     </w:r>
     <w:r>
       <w:rPr>
-        <w:rFonts w:ascii="Arial" w:hAnsi="Arial" w:cs="Arial"/>
         <w:color w:val="7F7F7F"/>
         <w:sz w:val="18"/>
         <w:szCs w:val="18"/>
@@ -1202,7 +1187,6 @@
     </w:r>
     <w:r>
       <w:rPr>
-        <w:rFonts w:ascii="Arial" w:hAnsi="Arial" w:cs="Arial"/>
         <w:color w:val="7F7F7F"/>
         <w:sz w:val="18"/>
         <w:szCs w:val="18"/>
@@ -1211,7 +1195,6 @@
     </w:r>
     <w:r>
       <w:rPr>
-        <w:rFonts w:ascii="Arial" w:hAnsi="Arial" w:cs="Arial"/>
         <w:color w:val="7F7F7F"/>
         <w:sz w:val="18"/>
         <w:szCs w:val="18"/>
@@ -1220,7 +1203,6 @@
     </w:r>
     <w:r>
       <w:rPr>
-        <w:rFonts w:ascii="Arial" w:hAnsi="Arial" w:cs="Arial"/>
         <w:noProof/>
         <w:color w:val="7F7F7F"/>
         <w:sz w:val="18"/>
@@ -1230,33 +1212,12 @@
     </w:r>
     <w:r>
       <w:rPr>
-        <w:rFonts w:ascii="Arial" w:hAnsi="Arial" w:cs="Arial"/>
         <w:color w:val="7F7F7F"/>
         <w:sz w:val="18"/>
         <w:szCs w:val="18"/>
       </w:rPr>
       <w:fldChar w:fldCharType="end"/>
     </w:r>
-  </w:p>
-</w:ftr>
-</file>
-
-<file path=word/footer2.xml><?xml version="1.0" encoding="utf-8"?>
-<w:ftr xmlns:m="http://schemas.openxmlformats.org/officeDocument/2006/math" xmlns:mc="http://schemas.openxmlformats.org/markup-compatibility/2006" xmlns:mo="http://schemas.microsoft.com/office/mac/office/2008/main" xmlns:mv="urn:schemas-microsoft-com:mac:vml" xmlns:o="urn:schemas-microsoft-com:office:office" xmlns:r="http://schemas.openxmlformats.org/officeDocument/2006/relationships" xmlns:v="urn:schemas-microsoft-com:vml" xmlns:w10="urn:schemas-microsoft-com:office:word" xmlns:w14="http://schemas.microsoft.com/office/word/2010/wordml" xmlns:w="http://schemas.openxmlformats.org/wordprocessingml/2006/main" xmlns:wne="http://schemas.microsoft.com/office/word/2006/wordml" xmlns:wp14="http://schemas.microsoft.com/office/word/2010/wordprocessingDrawing" xmlns:wp="http://schemas.openxmlformats.org/drawingml/2006/wordprocessingDrawing" xmlns:wpc="http://schemas.microsoft.com/office/word/2010/wordprocessingCanvas" xmlns:wpg="http://schemas.microsoft.com/office/word/2010/wordprocessingGroup" xmlns:wpi="http://schemas.microsoft.com/office/word/2010/wordprocessingInk" xmlns:wps="http://schemas.microsoft.com/office/word/2010/wordprocessingShape" mc:Ignorable="w14 wp14">
-  <w:p xmlns:wp14="http://schemas.microsoft.com/office/word/2010/wordml" wp14:textId="77777777">
-    <w:pPr>
-      <w:pStyle w:val="Footer"/>
-    </w:pPr>
-  </w:p>
-</w:ftr>
-</file>
-
-<file path=word/footer3.xml><?xml version="1.0" encoding="utf-8"?>
-<w:ftr xmlns:m="http://schemas.openxmlformats.org/officeDocument/2006/math" xmlns:mc="http://schemas.openxmlformats.org/markup-compatibility/2006" xmlns:mo="http://schemas.microsoft.com/office/mac/office/2008/main" xmlns:mv="urn:schemas-microsoft-com:mac:vml" xmlns:o="urn:schemas-microsoft-com:office:office" xmlns:r="http://schemas.openxmlformats.org/officeDocument/2006/relationships" xmlns:v="urn:schemas-microsoft-com:vml" xmlns:w10="urn:schemas-microsoft-com:office:word" xmlns:w14="http://schemas.microsoft.com/office/word/2010/wordml" xmlns:w="http://schemas.openxmlformats.org/wordprocessingml/2006/main" xmlns:wne="http://schemas.microsoft.com/office/word/2006/wordml" xmlns:wp14="http://schemas.microsoft.com/office/word/2010/wordprocessingDrawing" xmlns:wp="http://schemas.openxmlformats.org/drawingml/2006/wordprocessingDrawing" xmlns:wpc="http://schemas.microsoft.com/office/word/2010/wordprocessingCanvas" xmlns:wpg="http://schemas.microsoft.com/office/word/2010/wordprocessingGroup" xmlns:wpi="http://schemas.microsoft.com/office/word/2010/wordprocessingInk" xmlns:wps="http://schemas.microsoft.com/office/word/2010/wordprocessingShape" mc:Ignorable="w14 wp14">
-  <w:p xmlns:wp14="http://schemas.microsoft.com/office/word/2010/wordml" wp14:textId="77777777">
-    <w:pPr>
-      <w:pStyle w:val="Footer"/>
-    </w:pPr>
   </w:p>
 </w:ftr>
 </file>
@@ -1288,7 +1249,6 @@
     </w:pPr>
     <w:r>
       <w:rPr>
-        <w:rFonts w:ascii="Arial" w:hAnsi="Arial" w:cs="Arial"/>
         <w:i/>
         <w:iCs/>
         <w:color w:val="7F7F7F"/>
@@ -1297,26 +1257,6 @@
       </w:rPr>
       <w:t>C964 — Computer Science Capstone Topic Approval (Task 1)</w:t>
     </w:r>
-  </w:p>
-</w:hdr>
-</file>
-
-<file path=word/header2.xml><?xml version="1.0" encoding="utf-8"?>
-<w:hdr xmlns:m="http://schemas.openxmlformats.org/officeDocument/2006/math" xmlns:mc="http://schemas.openxmlformats.org/markup-compatibility/2006" xmlns:mo="http://schemas.microsoft.com/office/mac/office/2008/main" xmlns:mv="urn:schemas-microsoft-com:mac:vml" xmlns:o="urn:schemas-microsoft-com:office:office" xmlns:r="http://schemas.openxmlformats.org/officeDocument/2006/relationships" xmlns:v="urn:schemas-microsoft-com:vml" xmlns:w10="urn:schemas-microsoft-com:office:word" xmlns:w14="http://schemas.microsoft.com/office/word/2010/wordml" xmlns:w="http://schemas.openxmlformats.org/wordprocessingml/2006/main" xmlns:wne="http://schemas.microsoft.com/office/word/2006/wordml" xmlns:wp14="http://schemas.microsoft.com/office/word/2010/wordprocessingDrawing" xmlns:wp="http://schemas.openxmlformats.org/drawingml/2006/wordprocessingDrawing" xmlns:wpc="http://schemas.microsoft.com/office/word/2010/wordprocessingCanvas" xmlns:wpg="http://schemas.microsoft.com/office/word/2010/wordprocessingGroup" xmlns:wpi="http://schemas.microsoft.com/office/word/2010/wordprocessingInk" xmlns:wps="http://schemas.microsoft.com/office/word/2010/wordprocessingShape" mc:Ignorable="w14 wp14">
-  <w:p xmlns:wp14="http://schemas.microsoft.com/office/word/2010/wordml" wp14:textId="77777777">
-    <w:pPr>
-      <w:pStyle w:val="Header"/>
-    </w:pPr>
-  </w:p>
-</w:hdr>
-</file>
-
-<file path=word/header3.xml><?xml version="1.0" encoding="utf-8"?>
-<w:hdr xmlns:m="http://schemas.openxmlformats.org/officeDocument/2006/math" xmlns:mc="http://schemas.openxmlformats.org/markup-compatibility/2006" xmlns:mo="http://schemas.microsoft.com/office/mac/office/2008/main" xmlns:mv="urn:schemas-microsoft-com:mac:vml" xmlns:o="urn:schemas-microsoft-com:office:office" xmlns:r="http://schemas.openxmlformats.org/officeDocument/2006/relationships" xmlns:v="urn:schemas-microsoft-com:vml" xmlns:w10="urn:schemas-microsoft-com:office:word" xmlns:w14="http://schemas.microsoft.com/office/word/2010/wordml" xmlns:w="http://schemas.openxmlformats.org/wordprocessingml/2006/main" xmlns:wne="http://schemas.microsoft.com/office/word/2006/wordml" xmlns:wp14="http://schemas.microsoft.com/office/word/2010/wordprocessingDrawing" xmlns:wp="http://schemas.openxmlformats.org/drawingml/2006/wordprocessingDrawing" xmlns:wpc="http://schemas.microsoft.com/office/word/2010/wordprocessingCanvas" xmlns:wpg="http://schemas.microsoft.com/office/word/2010/wordprocessingGroup" xmlns:wpi="http://schemas.microsoft.com/office/word/2010/wordprocessingInk" xmlns:wps="http://schemas.microsoft.com/office/word/2010/wordprocessingShape" mc:Ignorable="w14 wp14">
-  <w:p xmlns:wp14="http://schemas.microsoft.com/office/word/2010/wordml" wp14:textId="77777777">
-    <w:pPr>
-      <w:pStyle w:val="Header"/>
-    </w:pPr>
   </w:p>
 </w:hdr>
 </file>
@@ -1595,7 +1535,7 @@
 </file>
 
 <file path=word/styles.xml><?xml version="1.0" encoding="utf-8"?>
-<w:styles xmlns:wp14="http://schemas.microsoft.com/office/word/2010/wordprocessingDrawing" xmlns:mc="http://schemas.openxmlformats.org/markup-compatibility/2006" xmlns:r="http://schemas.openxmlformats.org/officeDocument/2006/relationships" xmlns:w="http://schemas.openxmlformats.org/wordprocessingml/2006/main" xmlns:w14="http://schemas.microsoft.com/office/word/2010/wordml" xmlns:w15="http://schemas.microsoft.com/office/word/2012/wordml" xmlns:w16cex="http://schemas.microsoft.com/office/word/2018/wordml/cex" xmlns:w16cid="http://schemas.microsoft.com/office/word/2016/wordml/cid" xmlns:w16="http://schemas.microsoft.com/office/word/2018/wordml" xmlns:w16du="http://schemas.microsoft.com/office/word/2023/wordml/word16du" xmlns:w16sdtdh="http://schemas.microsoft.com/office/word/2020/wordml/sdtdatahash" xmlns:w16sdtfl="http://schemas.microsoft.com/office/word/2024/wordml/sdtformatlock" xmlns:w16se="http://schemas.microsoft.com/office/word/2015/wordml/symex" mc:Ignorable="w14 w15 w16se w16cid w16 w16cex w16sdtdh w16sdtfl w16du wp14">
+<w:styles xmlns:mc="http://schemas.openxmlformats.org/markup-compatibility/2006" xmlns:r="http://schemas.openxmlformats.org/officeDocument/2006/relationships" xmlns:w="http://schemas.openxmlformats.org/wordprocessingml/2006/main" xmlns:w14="http://schemas.microsoft.com/office/word/2010/wordml" xmlns:w15="http://schemas.microsoft.com/office/word/2012/wordml" xmlns:w16cex="http://schemas.microsoft.com/office/word/2018/wordml/cex" xmlns:w16cid="http://schemas.microsoft.com/office/word/2016/wordml/cid" xmlns:w16="http://schemas.microsoft.com/office/word/2018/wordml" xmlns:w16du="http://schemas.microsoft.com/office/word/2023/wordml/word16du" xmlns:w16sdtdh="http://schemas.microsoft.com/office/word/2020/wordml/sdtdatahash" xmlns:w16sdtfl="http://schemas.microsoft.com/office/word/2024/wordml/sdtformatlock" xmlns:w16se="http://schemas.microsoft.com/office/word/2015/wordml/symex" mc:Ignorable="w14 w15 w16se w16cid w16 w16cex w16sdtdh w16sdtfl w16du">
   <w:docDefaults>
     <w:rPrDefault>
       <w:rPr>
@@ -1988,11 +1928,6 @@
   <w:style w:type="paragraph" w:styleId="Normal" w:default="1">
     <w:name w:val="Normal"/>
     <w:qFormat/>
-    <w:rPr>
-      <w:rFonts w:ascii="Arial" w:hAnsi="Arial" w:cs="Arial"/>
-      <w:color w:val="000000"/>
-      <w:sz w:val="28"/>
-    </w:rPr>
   </w:style>
   <w:style w:type="paragraph" w:styleId="Heading1">
     <w:name w:val="heading 1"/>
@@ -2002,10 +1937,8 @@
       <w:outlineLvl w:val="0"/>
     </w:pPr>
     <w:rPr>
-      <w:rFonts w:ascii="Arial" w:hAnsi="Arial"/>
-      <w:b/>
-      <w:color w:val="002855"/>
-      <w:sz w:val="48"/>
+      <w:color w:val="2E74B5"/>
+      <w:sz w:val="32"/>
       <w:szCs w:val="32"/>
     </w:rPr>
   </w:style>
@@ -2019,10 +1952,8 @@
       <w:outlineLvl w:val="1"/>
     </w:pPr>
     <w:rPr>
-      <w:rFonts w:ascii="Arial" w:hAnsi="Arial"/>
-      <w:b/>
-      <w:color w:val="002855"/>
-      <w:sz w:val="44"/>
+      <w:color w:val="2E74B5"/>
+      <w:sz w:val="26"/>
       <w:szCs w:val="26"/>
     </w:rPr>
   </w:style>
@@ -2036,10 +1967,8 @@
       <w:outlineLvl w:val="2"/>
     </w:pPr>
     <w:rPr>
-      <w:rFonts w:ascii="Arial" w:hAnsi="Arial"/>
-      <w:b/>
-      <w:color w:val="002855"/>
-      <w:sz w:val="36"/>
+      <w:color w:val="1F4D78"/>
+      <w:sz w:val="24"/>
       <w:szCs w:val="24"/>
     </w:rPr>
   </w:style>
@@ -2053,12 +1982,9 @@
       <w:outlineLvl w:val="3"/>
     </w:pPr>
     <w:rPr>
-      <w:rFonts w:ascii="Arial" w:hAnsi="Arial"/>
-      <w:b/>
       <w:i/>
       <w:iCs/>
-      <w:color w:val="002855"/>
-      <w:sz w:val="28"/>
+      <w:color w:val="2E74B5"/>
     </w:rPr>
   </w:style>
   <w:style w:type="paragraph" w:styleId="Heading5">
@@ -2119,10 +2045,7 @@
     <w:uiPriority w:val="10"/>
     <w:qFormat/>
     <w:rPr>
-      <w:rFonts w:ascii="Arial" w:hAnsi="Arial"/>
-      <w:b/>
-      <w:color w:val="002855"/>
-      <w:sz w:val="64"/>
+      <w:sz w:val="56"/>
       <w:szCs w:val="56"/>
     </w:rPr>
   </w:style>
@@ -2143,7 +2066,7 @@
     <w:uiPriority w:val="99"/>
     <w:unhideWhenUsed/>
     <w:rPr>
-      <w:color w:val="46B1EF"/>
+      <w:color w:val="0563C1"/>
       <w:u w:val="single"/>
     </w:rPr>
   </w:style>
@@ -2528,10 +2451,9 @@
 </file>
 
 <file path=customXml/item1.xml><?xml version="1.0" encoding="utf-8"?>
-<ct:contentTypeSchema xmlns:ct="http://schemas.microsoft.com/office/2006/metadata/contentType" xmlns:ma="http://schemas.microsoft.com/office/2006/metadata/properties/metaAttributes" ct:_="" ma:_="" ma:contentTypeName="Document" ma:contentTypeID="0x010100BD6C6811FDA4354DADCD440B75A43D37" ma:contentTypeVersion="11" ma:contentTypeDescription="Create a new document." ma:contentTypeScope="" ma:versionID="a91333966e9b5d4bdd13b64d2abe3577">
-  <xsd:schema xmlns:xsd="http://www.w3.org/2001/XMLSchema" xmlns:xs="http://www.w3.org/2001/XMLSchema" xmlns:p="http://schemas.microsoft.com/office/2006/metadata/properties" xmlns:ns2="c340dd69-6dcb-4f68-be59-83f5ced86ed4" xmlns:ns3="90ab80b9-a678-4acf-968e-12ab5f1680e1" targetNamespace="http://schemas.microsoft.com/office/2006/metadata/properties" ma:root="true" ma:fieldsID="515f04c4260719a37f25d194220eca20" ns2:_="" ns3:_="">
+<ct:contentTypeSchema xmlns:ct="http://schemas.microsoft.com/office/2006/metadata/contentType" xmlns:ma="http://schemas.microsoft.com/office/2006/metadata/properties/metaAttributes" ct:_="" ma:_="" ma:contentTypeName="Document" ma:contentTypeID="0x010100BD6C6811FDA4354DADCD440B75A43D37" ma:contentTypeVersion="3" ma:contentTypeDescription="Create a new document." ma:contentTypeScope="" ma:versionID="cca1146c5ddd7f7207d93b53ec4b7890">
+  <xsd:schema xmlns:xsd="http://www.w3.org/2001/XMLSchema" xmlns:xs="http://www.w3.org/2001/XMLSchema" xmlns:p="http://schemas.microsoft.com/office/2006/metadata/properties" xmlns:ns2="c340dd69-6dcb-4f68-be59-83f5ced86ed4" targetNamespace="http://schemas.microsoft.com/office/2006/metadata/properties" ma:root="true" ma:fieldsID="0b09d8cc436d6a436f5197c02775f266" ns2:_="">
     <xsd:import namespace="c340dd69-6dcb-4f68-be59-83f5ced86ed4"/>
-    <xsd:import namespace="90ab80b9-a678-4acf-968e-12ab5f1680e1"/>
     <xsd:element name="properties">
       <xsd:complexType>
         <xsd:sequence>
@@ -2541,13 +2463,6 @@
                 <xsd:element ref="ns2:MediaServiceMetadata" minOccurs="0"/>
                 <xsd:element ref="ns2:MediaServiceFastMetadata" minOccurs="0"/>
                 <xsd:element ref="ns2:MediaServiceSearchProperties" minOccurs="0"/>
-                <xsd:element ref="ns2:MediaServiceDateTaken" minOccurs="0"/>
-                <xsd:element ref="ns2:MediaServiceGenerationTime" minOccurs="0"/>
-                <xsd:element ref="ns2:MediaServiceEventHashCode" minOccurs="0"/>
-                <xsd:element ref="ns2:MediaLengthInSeconds" minOccurs="0"/>
-                <xsd:element ref="ns2:lcf76f155ced4ddcb4097134ff3c332f" minOccurs="0"/>
-                <xsd:element ref="ns3:TaxCatchAll" minOccurs="0"/>
-                <xsd:element ref="ns2:MediaServiceOCR" minOccurs="0"/>
               </xsd:all>
             </xsd:complexType>
           </xsd:element>
@@ -2572,55 +2487,6 @@
       <xsd:simpleType>
         <xsd:restriction base="dms:Note"/>
       </xsd:simpleType>
-    </xsd:element>
-    <xsd:element name="MediaServiceDateTaken" ma:index="11" nillable="true" ma:displayName="MediaServiceDateTaken" ma:hidden="true" ma:indexed="true" ma:internalName="MediaServiceDateTaken" ma:readOnly="true">
-      <xsd:simpleType>
-        <xsd:restriction base="dms:Text"/>
-      </xsd:simpleType>
-    </xsd:element>
-    <xsd:element name="MediaServiceGenerationTime" ma:index="12" nillable="true" ma:displayName="MediaServiceGenerationTime" ma:hidden="true" ma:internalName="MediaServiceGenerationTime" ma:readOnly="true">
-      <xsd:simpleType>
-        <xsd:restriction base="dms:Text"/>
-      </xsd:simpleType>
-    </xsd:element>
-    <xsd:element name="MediaServiceEventHashCode" ma:index="13" nillable="true" ma:displayName="MediaServiceEventHashCode" ma:hidden="true" ma:internalName="MediaServiceEventHashCode" ma:readOnly="true">
-      <xsd:simpleType>
-        <xsd:restriction base="dms:Text"/>
-      </xsd:simpleType>
-    </xsd:element>
-    <xsd:element name="MediaLengthInSeconds" ma:index="14" nillable="true" ma:displayName="MediaLengthInSeconds" ma:hidden="true" ma:internalName="MediaLengthInSeconds" ma:readOnly="true">
-      <xsd:simpleType>
-        <xsd:restriction base="dms:Unknown"/>
-      </xsd:simpleType>
-    </xsd:element>
-    <xsd:element name="lcf76f155ced4ddcb4097134ff3c332f" ma:index="16" nillable="true" ma:taxonomy="true" ma:internalName="lcf76f155ced4ddcb4097134ff3c332f" ma:taxonomyFieldName="MediaServiceImageTags" ma:displayName="Image Tags" ma:readOnly="false" ma:fieldId="{5cf76f15-5ced-4ddc-b409-7134ff3c332f}" ma:taxonomyMulti="true" ma:sspId="acb2b71a-ac8b-4347-9f63-f75d234e2459" ma:termSetId="09814cd3-568e-fe90-9814-8d621ff8fb84" ma:anchorId="fba54fb3-c3e1-fe81-a776-ca4b69148c4d" ma:open="true" ma:isKeyword="false">
-      <xsd:complexType>
-        <xsd:sequence>
-          <xsd:element ref="pc:Terms" minOccurs="0" maxOccurs="1"/>
-        </xsd:sequence>
-      </xsd:complexType>
-    </xsd:element>
-    <xsd:element name="MediaServiceOCR" ma:index="18" nillable="true" ma:displayName="Extracted Text" ma:internalName="MediaServiceOCR" ma:readOnly="true">
-      <xsd:simpleType>
-        <xsd:restriction base="dms:Note">
-          <xsd:maxLength value="255"/>
-        </xsd:restriction>
-      </xsd:simpleType>
-    </xsd:element>
-  </xsd:schema>
-  <xsd:schema xmlns:xsd="http://www.w3.org/2001/XMLSchema" xmlns:xs="http://www.w3.org/2001/XMLSchema" xmlns:dms="http://schemas.microsoft.com/office/2006/documentManagement/types" xmlns:pc="http://schemas.microsoft.com/office/infopath/2007/PartnerControls" targetNamespace="90ab80b9-a678-4acf-968e-12ab5f1680e1" elementFormDefault="qualified">
-    <xsd:import namespace="http://schemas.microsoft.com/office/2006/documentManagement/types"/>
-    <xsd:import namespace="http://schemas.microsoft.com/office/infopath/2007/PartnerControls"/>
-    <xsd:element name="TaxCatchAll" ma:index="17" nillable="true" ma:displayName="Taxonomy Catch All Column" ma:hidden="true" ma:list="{91cc3007-8d51-4721-bdcb-fe3999517373}" ma:internalName="TaxCatchAll" ma:showField="CatchAllData" ma:web="90ab80b9-a678-4acf-968e-12ab5f1680e1">
-      <xsd:complexType>
-        <xsd:complexContent>
-          <xsd:extension base="dms:MultiChoiceLookup">
-            <xsd:sequence>
-              <xsd:element name="Value" type="dms:Lookup" maxOccurs="unbounded" minOccurs="0" nillable="true"/>
-            </xsd:sequence>
-          </xsd:extension>
-        </xsd:complexContent>
-      </xsd:complexType>
     </xsd:element>
   </xsd:schema>
   <xsd:schema xmlns="http://schemas.openxmlformats.org/package/2006/metadata/core-properties" xmlns:xsd="http://www.w3.org/2001/XMLSchema" xmlns:xsi="http://www.w3.org/2001/XMLSchema-instance" xmlns:dc="http://purl.org/dc/elements/1.1/" xmlns:dcterms="http://purl.org/dc/terms/" xmlns:odoc="http://schemas.microsoft.com/internal/obd" targetNamespace="http://schemas.openxmlformats.org/package/2006/metadata/core-properties" elementFormDefault="qualified" attributeFormDefault="unqualified" blockDefault="#all">
@@ -2733,17 +2599,12 @@
 
 <file path=customXml/item3.xml><?xml version="1.0" encoding="utf-8"?>
 <p:properties xmlns:p="http://schemas.microsoft.com/office/2006/metadata/properties" xmlns:xsi="http://www.w3.org/2001/XMLSchema-instance" xmlns:pc="http://schemas.microsoft.com/office/infopath/2007/PartnerControls">
-  <documentManagement>
-    <lcf76f155ced4ddcb4097134ff3c332f xmlns="c340dd69-6dcb-4f68-be59-83f5ced86ed4">
-      <Terms xmlns="http://schemas.microsoft.com/office/infopath/2007/PartnerControls"/>
-    </lcf76f155ced4ddcb4097134ff3c332f>
-    <TaxCatchAll xmlns="90ab80b9-a678-4acf-968e-12ab5f1680e1" xsi:nil="true"/>
-  </documentManagement>
+  <documentManagement/>
 </p:properties>
 </file>
 
 <file path=customXml/itemProps1.xml><?xml version="1.0" encoding="utf-8"?>
-<ds:datastoreItem xmlns:ds="http://schemas.openxmlformats.org/officeDocument/2006/customXml" ds:itemID="{45FF6206-194D-4AF1-BEE4-7D584DD2BC2E}"/>
+<ds:datastoreItem xmlns:ds="http://schemas.openxmlformats.org/officeDocument/2006/customXml" ds:itemID="{4136C733-11A2-49B7-A540-48F18DDD01AA}"/>
 </file>
 
 <file path=customXml/itemProps2.xml><?xml version="1.0" encoding="utf-8"?>

</xml_diff>